<commit_message>
Fecha nomes: SodaFil (produto) e Bull Soda Trick (truque) nos briefs 04 e 06
Co-Authored-By: Claude Fable 5.1 <noreply@anthropic.com>
Claude-Session: https://claude.ai/code/session_017HYp1xhSzB6Ui5hyJvLbGE
</commit_message>
<xml_diff>
--- a/analise-ed/06_Briefing_Edicao_Longhorn_Soda.docx
+++ b/analise-ed/06_Briefing_Edicao_Longhorn_Soda.docx
@@ -2,13 +2,13 @@
 <file path=word/document.xml><?xml version="1.0" encoding="utf-8"?>
 <w:document xmlns:w="http://schemas.openxmlformats.org/wordprocessingml/2006/main" xmlns:m="http://schemas.openxmlformats.org/officeDocument/2006/math" xmlns:r="http://schemas.openxmlformats.org/officeDocument/2006/relationships" xmlns:o="urn:schemas-microsoft-com:office:office" xmlns:v="urn:schemas-microsoft-com:vml" xmlns:w10="urn:schemas-microsoft-com:office:word" xmlns:a="http://schemas.openxmlformats.org/drawingml/2006/main" xmlns:pic="http://schemas.openxmlformats.org/drawingml/2006/picture" xmlns:wp="http://schemas.openxmlformats.org/drawingml/2006/wordprocessingDrawing">
   <w:body>
-    <w:bookmarkStart w:id="55" w:name="briefing-de-edição-longhorn-soda"/>
+    <w:bookmarkStart w:id="55" w:name="Xa7501f4eaa17e56b0b4a928dc6c15d798cdec0c"/>
     <w:p>
       <w:pPr>
         <w:pStyle w:val="Heading1"/>
       </w:pPr>
       <w:r>
-        <w:t xml:space="preserve">Briefing de Edição — Longhorn Soda</w:t>
+        <w:t xml:space="preserve">Briefing de Edição — SodaFil (Bull Soda Trick)</w:t>
       </w:r>
     </w:p>
     <w:p>
@@ -42,7 +42,7 @@
         <w:t xml:space="preserve"> </w:t>
       </w:r>
       <w:r>
-        <w:t xml:space="preserve">briefing de edição da Jelly Fil (05) + brief de oferta Longhorn Soda (04)</w:t>
+        <w:t xml:space="preserve">briefing de edição da Jelly Fil (05) + brief de oferta SodaFil (04)</w:t>
       </w:r>
       <w:r>
         <w:t xml:space="preserve"> </w:t>
@@ -6899,16 +6899,16 @@
         <w:pStyle w:val="Compact"/>
       </w:pPr>
       <w:r>
-        <w:t xml:space="preserve">Inserts do produto: frasco Longhorn Soda (rótulo com silhueta de chifres, paleta terrosa/azul-escuro) com fumaça</w:t>
-      </w:r>
-      <w:r>
-        <w:t xml:space="preserve"> </w:t>
-      </w:r>
-      <w:r>
-        <w:t xml:space="preserve">“</w:t>
-      </w:r>
-      <w:r>
-        <w:t xml:space="preserve">And that’s how Longhorn Soda was born</w:t>
+        <w:t xml:space="preserve">Inserts do produto: frasco SodaFil (rótulo com silhueta de chifres de Longhorn, paleta azul-escuro + dourado herdada da JellyFil) com fumaça</w:t>
+      </w:r>
+      <w:r>
+        <w:t xml:space="preserve"> </w:t>
+      </w:r>
+      <w:r>
+        <w:t xml:space="preserve">“</w:t>
+      </w:r>
+      <w:r>
+        <w:t xml:space="preserve">And that’s how SodaFil was born</w:t>
       </w:r>
       <w:r>
         <w:t xml:space="preserve">”</w:t>
@@ -7071,7 +7071,7 @@
         <w:t xml:space="preserve">“</w:t>
       </w:r>
       <w:r>
-        <w:t xml:space="preserve">Longhorn Soda is the first and only</w:t>
+        <w:t xml:space="preserve">SodaFil is the first and only</w:t>
       </w:r>
       <w:r>
         <w:t xml:space="preserve">”</w:t>
@@ -7263,7 +7263,7 @@
         <w:t xml:space="preserve">‘</w:t>
       </w:r>
       <w:r>
-        <w:t xml:space="preserve">Longhorn Soda</w:t>
+        <w:t xml:space="preserve">SodaFil</w:t>
       </w:r>
       <w:r>
         <w:t xml:space="preserve">’</w:t>
@@ -8040,7 +8040,7 @@
         <w:t xml:space="preserve">“</w:t>
       </w:r>
       <w:r>
-        <w:t xml:space="preserve">BULL GUARANTEE · 60 DAYS · KEEP THE BOTTLES</w:t>
+        <w:t xml:space="preserve">THE BULL GUARANTEE · 60 DAYS · KEEP THE BOTTLES</w:t>
       </w:r>
       <w:r>
         <w:t xml:space="preserve">”</w:t>

</xml_diff>